<commit_message>
Lab 9 - update date prob1
Lab 9 - update date prob1
</commit_message>
<xml_diff>
--- a/Assigment/Lab9/Lab9_Phuong Nguyen.docx
+++ b/Assigment/Lab9/Lab9_Phuong Nguyen.docx
@@ -111,20 +111,260 @@
         <w:spacing w:after="0" w:line="240" w:lineRule="auto"/>
         <w:rPr>
           <w:rFonts w:asciiTheme="majorHAnsi" w:eastAsia="Times New Roman" w:hAnsiTheme="majorHAnsi" w:cs="Arial"/>
-          <w:color w:val="EE0000"/>
-          <w:kern w:val="0"/>
-          <w14:ligatures w14:val="none"/>
-        </w:rPr>
-      </w:pPr>
-      <w:r>
-        <w:rPr>
-          <w:rFonts w:asciiTheme="majorHAnsi" w:eastAsia="Times New Roman" w:hAnsiTheme="majorHAnsi" w:cs="Arial"/>
-          <w:color w:val="EE0000"/>
-          <w:kern w:val="0"/>
-          <w14:ligatures w14:val="none"/>
-        </w:rPr>
-        <w:t>BBBBBBB</w:t>
-      </w:r>
+          <w:color w:val="000000" w:themeColor="text1"/>
+          <w:kern w:val="0"/>
+          <w14:ligatures w14:val="none"/>
+        </w:rPr>
+      </w:pPr>
+      <w:r>
+        <w:rPr>
+          <w:rFonts w:asciiTheme="majorHAnsi" w:eastAsia="Times New Roman" w:hAnsiTheme="majorHAnsi" w:cs="Arial"/>
+          <w:color w:val="000000" w:themeColor="text1"/>
+          <w:kern w:val="0"/>
+          <w14:ligatures w14:val="none"/>
+        </w:rPr>
+        <w:t>Source c</w:t>
+      </w:r>
+      <w:r>
+        <w:rPr>
+          <w:rFonts w:asciiTheme="majorHAnsi" w:eastAsia="Times New Roman" w:hAnsiTheme="majorHAnsi" w:cs="Arial"/>
+          <w:color w:val="000000" w:themeColor="text1"/>
+          <w:kern w:val="0"/>
+          <w14:ligatures w14:val="none"/>
+        </w:rPr>
+        <w:t>ode:</w:t>
+      </w:r>
+    </w:p>
+    <w:p>
+      <w:pPr>
+        <w:pStyle w:val="ListParagraph"/>
+        <w:spacing w:after="0" w:line="240" w:lineRule="auto"/>
+        <w:ind w:left="1440"/>
+        <w:rPr>
+          <w:rFonts w:asciiTheme="majorHAnsi" w:eastAsia="Times New Roman" w:hAnsiTheme="majorHAnsi" w:cs="Arial"/>
+          <w:color w:val="000000" w:themeColor="text1"/>
+          <w:kern w:val="0"/>
+          <w14:ligatures w14:val="none"/>
+        </w:rPr>
+      </w:pPr>
+    </w:p>
+    <w:p>
+      <w:pPr>
+        <w:pStyle w:val="HTMLPreformatted"/>
+        <w:shd w:val="clear" w:color="auto" w:fill="191A1C"/>
+        <w:ind w:left="720"/>
+        <w:rPr>
+          <w:color w:val="BCBEC4"/>
+        </w:rPr>
+      </w:pPr>
+      <w:r>
+        <w:rPr>
+          <w:color w:val="B3AE60"/>
+        </w:rPr>
+        <w:t>@Override</w:t>
+      </w:r>
+      <w:r>
+        <w:rPr>
+          <w:color w:val="B3AE60"/>
+        </w:rPr>
+        <w:br/>
+      </w:r>
+      <w:r>
+        <w:rPr>
+          <w:color w:val="CF8E6D"/>
+        </w:rPr>
+        <w:t xml:space="preserve">public boolean </w:t>
+      </w:r>
+      <w:r>
+        <w:rPr>
+          <w:color w:val="56A8F5"/>
+        </w:rPr>
+        <w:t>equals</w:t>
+      </w:r>
+      <w:r>
+        <w:rPr>
+          <w:color w:val="BCBEC4"/>
+        </w:rPr>
+        <w:t>(Object ob) {</w:t>
+      </w:r>
+      <w:r>
+        <w:rPr>
+          <w:color w:val="BCBEC4"/>
+        </w:rPr>
+        <w:br/>
+        <w:t xml:space="preserve">    </w:t>
+      </w:r>
+      <w:r>
+        <w:rPr>
+          <w:color w:val="CF8E6D"/>
+        </w:rPr>
+        <w:t xml:space="preserve">if </w:t>
+      </w:r>
+      <w:r>
+        <w:rPr>
+          <w:color w:val="BCBEC4"/>
+        </w:rPr>
+        <w:t xml:space="preserve">(ob == </w:t>
+      </w:r>
+      <w:r>
+        <w:rPr>
+          <w:color w:val="CF8E6D"/>
+        </w:rPr>
+        <w:t>null</w:t>
+      </w:r>
+      <w:r>
+        <w:rPr>
+          <w:color w:val="BCBEC4"/>
+        </w:rPr>
+        <w:t xml:space="preserve">) </w:t>
+      </w:r>
+      <w:r>
+        <w:rPr>
+          <w:color w:val="CF8E6D"/>
+        </w:rPr>
+        <w:t>return false</w:t>
+      </w:r>
+      <w:r>
+        <w:rPr>
+          <w:color w:val="BCBEC4"/>
+        </w:rPr>
+        <w:t>;</w:t>
+      </w:r>
+      <w:r>
+        <w:rPr>
+          <w:color w:val="BCBEC4"/>
+        </w:rPr>
+        <w:br/>
+        <w:t xml:space="preserve">    </w:t>
+      </w:r>
+      <w:r>
+        <w:rPr>
+          <w:color w:val="CF8E6D"/>
+        </w:rPr>
+        <w:t xml:space="preserve">if </w:t>
+      </w:r>
+      <w:r>
+        <w:rPr>
+          <w:color w:val="BCBEC4"/>
+        </w:rPr>
+        <w:t xml:space="preserve">(!(ob </w:t>
+      </w:r>
+      <w:r>
+        <w:rPr>
+          <w:color w:val="CF8E6D"/>
+        </w:rPr>
+        <w:t xml:space="preserve">instanceof </w:t>
+      </w:r>
+      <w:r>
+        <w:rPr>
+          <w:color w:val="BCBEC4"/>
+        </w:rPr>
+        <w:t xml:space="preserve">Employee)) </w:t>
+      </w:r>
+      <w:r>
+        <w:rPr>
+          <w:color w:val="CF8E6D"/>
+        </w:rPr>
+        <w:t>return false</w:t>
+      </w:r>
+      <w:r>
+        <w:rPr>
+          <w:color w:val="BCBEC4"/>
+        </w:rPr>
+        <w:t>;</w:t>
+      </w:r>
+      <w:r>
+        <w:rPr>
+          <w:color w:val="BCBEC4"/>
+        </w:rPr>
+        <w:br/>
+        <w:t xml:space="preserve">    Employee e = (Employee)ob;</w:t>
+      </w:r>
+      <w:r>
+        <w:rPr>
+          <w:color w:val="BCBEC4"/>
+        </w:rPr>
+        <w:br/>
+        <w:t xml:space="preserve">    </w:t>
+      </w:r>
+      <w:r>
+        <w:rPr>
+          <w:color w:val="CF8E6D"/>
+        </w:rPr>
+        <w:t xml:space="preserve">return </w:t>
+      </w:r>
+      <w:r>
+        <w:rPr>
+          <w:color w:val="BCBEC4"/>
+        </w:rPr>
+        <w:t>e.getName().equals(</w:t>
+      </w:r>
+      <w:r>
+        <w:rPr>
+          <w:color w:val="CF8E6D"/>
+        </w:rPr>
+        <w:t>this</w:t>
+      </w:r>
+      <w:r>
+        <w:rPr>
+          <w:color w:val="BCBEC4"/>
+        </w:rPr>
+        <w:t>.</w:t>
+      </w:r>
+      <w:r>
+        <w:rPr>
+          <w:color w:val="C77DBB"/>
+        </w:rPr>
+        <w:t>name</w:t>
+      </w:r>
+      <w:r>
+        <w:rPr>
+          <w:color w:val="BCBEC4"/>
+        </w:rPr>
+        <w:t xml:space="preserve">) &amp;&amp; e.getSalary() == </w:t>
+      </w:r>
+      <w:r>
+        <w:rPr>
+          <w:color w:val="CF8E6D"/>
+        </w:rPr>
+        <w:t>this</w:t>
+      </w:r>
+      <w:r>
+        <w:rPr>
+          <w:color w:val="BCBEC4"/>
+        </w:rPr>
+        <w:t>.</w:t>
+      </w:r>
+      <w:r>
+        <w:rPr>
+          <w:color w:val="C77DBB"/>
+        </w:rPr>
+        <w:t>salary</w:t>
+      </w:r>
+      <w:r>
+        <w:rPr>
+          <w:color w:val="BCBEC4"/>
+        </w:rPr>
+        <w:t>;</w:t>
+      </w:r>
+      <w:r>
+        <w:rPr>
+          <w:color w:val="BCBEC4"/>
+        </w:rPr>
+        <w:br/>
+        <w:t>}</w:t>
+      </w:r>
+    </w:p>
+    <w:p>
+      <w:pPr>
+        <w:spacing w:after="0" w:line="240" w:lineRule="auto"/>
+        <w:rPr>
+          <w:rFonts w:asciiTheme="majorHAnsi" w:eastAsia="Times New Roman" w:hAnsiTheme="majorHAnsi" w:cs="Arial"/>
+          <w:color w:val="000000" w:themeColor="text1"/>
+          <w:kern w:val="0"/>
+          <w14:ligatures w14:val="none"/>
+        </w:rPr>
+      </w:pPr>
     </w:p>
     <w:p>
       <w:pPr>
@@ -136,20 +376,357 @@
         <w:spacing w:after="0" w:line="240" w:lineRule="auto"/>
         <w:rPr>
           <w:rFonts w:asciiTheme="majorHAnsi" w:eastAsia="Times New Roman" w:hAnsiTheme="majorHAnsi" w:cs="Arial"/>
-          <w:color w:val="EE0000"/>
-          <w:kern w:val="0"/>
-          <w14:ligatures w14:val="none"/>
-        </w:rPr>
-      </w:pPr>
-      <w:r>
-        <w:rPr>
-          <w:rFonts w:asciiTheme="majorHAnsi" w:eastAsia="Times New Roman" w:hAnsiTheme="majorHAnsi" w:cs="Arial"/>
-          <w:color w:val="EE0000"/>
-          <w:kern w:val="0"/>
-          <w14:ligatures w14:val="none"/>
-        </w:rPr>
-        <w:t>CCCCCC</w:t>
-      </w:r>
+          <w:color w:val="000000" w:themeColor="text1"/>
+          <w:kern w:val="0"/>
+          <w14:ligatures w14:val="none"/>
+        </w:rPr>
+      </w:pPr>
+      <w:r>
+        <w:rPr>
+          <w:rFonts w:asciiTheme="majorHAnsi" w:eastAsia="Times New Roman" w:hAnsiTheme="majorHAnsi" w:cs="Arial"/>
+          <w:color w:val="000000" w:themeColor="text1"/>
+          <w:kern w:val="0"/>
+          <w14:ligatures w14:val="none"/>
+        </w:rPr>
+        <w:t>Source code:</w:t>
+      </w:r>
+    </w:p>
+    <w:p>
+      <w:pPr>
+        <w:spacing w:after="0" w:line="240" w:lineRule="auto"/>
+        <w:rPr>
+          <w:rFonts w:asciiTheme="majorHAnsi" w:eastAsia="Times New Roman" w:hAnsiTheme="majorHAnsi" w:cs="Arial"/>
+          <w:color w:val="000000" w:themeColor="text1"/>
+          <w:kern w:val="0"/>
+          <w14:ligatures w14:val="none"/>
+        </w:rPr>
+      </w:pPr>
+    </w:p>
+    <w:p>
+      <w:pPr>
+        <w:pStyle w:val="ListParagraph"/>
+        <w:shd w:val="clear" w:color="auto" w:fill="191A1C"/>
+        <w:tabs>
+          <w:tab w:val="left" w:pos="916"/>
+          <w:tab w:val="left" w:pos="1832"/>
+          <w:tab w:val="left" w:pos="2748"/>
+          <w:tab w:val="left" w:pos="3664"/>
+          <w:tab w:val="left" w:pos="4580"/>
+          <w:tab w:val="left" w:pos="5496"/>
+          <w:tab w:val="left" w:pos="6412"/>
+          <w:tab w:val="left" w:pos="7328"/>
+          <w:tab w:val="left" w:pos="8244"/>
+          <w:tab w:val="left" w:pos="9160"/>
+          <w:tab w:val="left" w:pos="10076"/>
+          <w:tab w:val="left" w:pos="10992"/>
+          <w:tab w:val="left" w:pos="11908"/>
+          <w:tab w:val="left" w:pos="12824"/>
+          <w:tab w:val="left" w:pos="13740"/>
+          <w:tab w:val="left" w:pos="14656"/>
+        </w:tabs>
+        <w:spacing w:after="0" w:line="240" w:lineRule="auto"/>
+        <w:rPr>
+          <w:rFonts w:ascii="Courier New" w:eastAsia="Times New Roman" w:hAnsi="Courier New" w:cs="Courier New"/>
+          <w:color w:val="BCBEC4"/>
+          <w:kern w:val="0"/>
+          <w:sz w:val="20"/>
+          <w:szCs w:val="20"/>
+          <w14:ligatures w14:val="none"/>
+        </w:rPr>
+      </w:pPr>
+      <w:r>
+        <w:rPr>
+          <w:rFonts w:ascii="Courier New" w:eastAsia="Times New Roman" w:hAnsi="Courier New" w:cs="Courier New"/>
+          <w:color w:val="B3AE60"/>
+          <w:kern w:val="0"/>
+          <w:sz w:val="20"/>
+          <w:szCs w:val="20"/>
+          <w14:ligatures w14:val="none"/>
+        </w:rPr>
+        <w:t>@Override</w:t>
+      </w:r>
+      <w:r>
+        <w:rPr>
+          <w:rFonts w:ascii="Courier New" w:eastAsia="Times New Roman" w:hAnsi="Courier New" w:cs="Courier New"/>
+          <w:color w:val="B3AE60"/>
+          <w:kern w:val="0"/>
+          <w:sz w:val="20"/>
+          <w:szCs w:val="20"/>
+          <w14:ligatures w14:val="none"/>
+        </w:rPr>
+        <w:br/>
+      </w:r>
+      <w:r>
+        <w:rPr>
+          <w:rFonts w:ascii="Courier New" w:eastAsia="Times New Roman" w:hAnsi="Courier New" w:cs="Courier New"/>
+          <w:color w:val="CF8E6D"/>
+          <w:kern w:val="0"/>
+          <w:sz w:val="20"/>
+          <w:szCs w:val="20"/>
+          <w14:ligatures w14:val="none"/>
+        </w:rPr>
+        <w:t xml:space="preserve">public int </w:t>
+      </w:r>
+      <w:r>
+        <w:rPr>
+          <w:rFonts w:ascii="Courier New" w:eastAsia="Times New Roman" w:hAnsi="Courier New" w:cs="Courier New"/>
+          <w:color w:val="56A8F5"/>
+          <w:kern w:val="0"/>
+          <w:sz w:val="20"/>
+          <w:szCs w:val="20"/>
+          <w14:ligatures w14:val="none"/>
+        </w:rPr>
+        <w:t>hashCode</w:t>
+      </w:r>
+      <w:r>
+        <w:rPr>
+          <w:rFonts w:ascii="Courier New" w:eastAsia="Times New Roman" w:hAnsi="Courier New" w:cs="Courier New"/>
+          <w:color w:val="BCBEC4"/>
+          <w:kern w:val="0"/>
+          <w:sz w:val="20"/>
+          <w:szCs w:val="20"/>
+          <w14:ligatures w14:val="none"/>
+        </w:rPr>
+        <w:t>() {</w:t>
+      </w:r>
+      <w:r>
+        <w:rPr>
+          <w:rFonts w:ascii="Courier New" w:eastAsia="Times New Roman" w:hAnsi="Courier New" w:cs="Courier New"/>
+          <w:color w:val="BCBEC4"/>
+          <w:kern w:val="0"/>
+          <w:sz w:val="20"/>
+          <w:szCs w:val="20"/>
+          <w14:ligatures w14:val="none"/>
+        </w:rPr>
+        <w:br/>
+        <w:t xml:space="preserve">    </w:t>
+      </w:r>
+      <w:r>
+        <w:rPr>
+          <w:rFonts w:ascii="Courier New" w:eastAsia="Times New Roman" w:hAnsi="Courier New" w:cs="Courier New"/>
+          <w:color w:val="CF8E6D"/>
+          <w:kern w:val="0"/>
+          <w:sz w:val="20"/>
+          <w:szCs w:val="20"/>
+          <w14:ligatures w14:val="none"/>
+        </w:rPr>
+        <w:t xml:space="preserve">int </w:t>
+      </w:r>
+      <w:r>
+        <w:rPr>
+          <w:rFonts w:ascii="Courier New" w:eastAsia="Times New Roman" w:hAnsi="Courier New" w:cs="Courier New"/>
+          <w:color w:val="BCBEC4"/>
+          <w:kern w:val="0"/>
+          <w:sz w:val="20"/>
+          <w:szCs w:val="20"/>
+          <w14:ligatures w14:val="none"/>
+        </w:rPr>
+        <w:t xml:space="preserve">result = </w:t>
+      </w:r>
+      <w:r>
+        <w:rPr>
+          <w:rFonts w:ascii="Courier New" w:eastAsia="Times New Roman" w:hAnsi="Courier New" w:cs="Courier New"/>
+          <w:color w:val="2AACB8"/>
+          <w:kern w:val="0"/>
+          <w:sz w:val="20"/>
+          <w:szCs w:val="20"/>
+          <w14:ligatures w14:val="none"/>
+        </w:rPr>
+        <w:t>17</w:t>
+      </w:r>
+      <w:r>
+        <w:rPr>
+          <w:rFonts w:ascii="Courier New" w:eastAsia="Times New Roman" w:hAnsi="Courier New" w:cs="Courier New"/>
+          <w:color w:val="BCBEC4"/>
+          <w:kern w:val="0"/>
+          <w:sz w:val="20"/>
+          <w:szCs w:val="20"/>
+          <w14:ligatures w14:val="none"/>
+        </w:rPr>
+        <w:t>;</w:t>
+      </w:r>
+      <w:r>
+        <w:rPr>
+          <w:rFonts w:ascii="Courier New" w:eastAsia="Times New Roman" w:hAnsi="Courier New" w:cs="Courier New"/>
+          <w:color w:val="BCBEC4"/>
+          <w:kern w:val="0"/>
+          <w:sz w:val="20"/>
+          <w:szCs w:val="20"/>
+          <w14:ligatures w14:val="none"/>
+        </w:rPr>
+        <w:br/>
+        <w:t xml:space="preserve">    result = </w:t>
+      </w:r>
+      <w:r>
+        <w:rPr>
+          <w:rFonts w:ascii="Courier New" w:eastAsia="Times New Roman" w:hAnsi="Courier New" w:cs="Courier New"/>
+          <w:color w:val="2AACB8"/>
+          <w:kern w:val="0"/>
+          <w:sz w:val="20"/>
+          <w:szCs w:val="20"/>
+          <w14:ligatures w14:val="none"/>
+        </w:rPr>
+        <w:t xml:space="preserve">31 </w:t>
+      </w:r>
+      <w:r>
+        <w:rPr>
+          <w:rFonts w:ascii="Courier New" w:eastAsia="Times New Roman" w:hAnsi="Courier New" w:cs="Courier New"/>
+          <w:color w:val="BCBEC4"/>
+          <w:kern w:val="0"/>
+          <w:sz w:val="20"/>
+          <w:szCs w:val="20"/>
+          <w14:ligatures w14:val="none"/>
+        </w:rPr>
+        <w:t xml:space="preserve">* result + </w:t>
+      </w:r>
+      <w:r>
+        <w:rPr>
+          <w:rFonts w:ascii="Courier New" w:eastAsia="Times New Roman" w:hAnsi="Courier New" w:cs="Courier New"/>
+          <w:color w:val="C77DBB"/>
+          <w:kern w:val="0"/>
+          <w:sz w:val="20"/>
+          <w:szCs w:val="20"/>
+          <w14:ligatures w14:val="none"/>
+        </w:rPr>
+        <w:t>name</w:t>
+      </w:r>
+      <w:r>
+        <w:rPr>
+          <w:rFonts w:ascii="Courier New" w:eastAsia="Times New Roman" w:hAnsi="Courier New" w:cs="Courier New"/>
+          <w:color w:val="BCBEC4"/>
+          <w:kern w:val="0"/>
+          <w:sz w:val="20"/>
+          <w:szCs w:val="20"/>
+          <w14:ligatures w14:val="none"/>
+        </w:rPr>
+        <w:t>.hashCode();</w:t>
+      </w:r>
+      <w:r>
+        <w:rPr>
+          <w:rFonts w:ascii="Courier New" w:eastAsia="Times New Roman" w:hAnsi="Courier New" w:cs="Courier New"/>
+          <w:color w:val="BCBEC4"/>
+          <w:kern w:val="0"/>
+          <w:sz w:val="20"/>
+          <w:szCs w:val="20"/>
+          <w14:ligatures w14:val="none"/>
+        </w:rPr>
+        <w:br/>
+        <w:t xml:space="preserve">    result = </w:t>
+      </w:r>
+      <w:r>
+        <w:rPr>
+          <w:rFonts w:ascii="Courier New" w:eastAsia="Times New Roman" w:hAnsi="Courier New" w:cs="Courier New"/>
+          <w:color w:val="2AACB8"/>
+          <w:kern w:val="0"/>
+          <w:sz w:val="20"/>
+          <w:szCs w:val="20"/>
+          <w14:ligatures w14:val="none"/>
+        </w:rPr>
+        <w:t xml:space="preserve">31 </w:t>
+      </w:r>
+      <w:r>
+        <w:rPr>
+          <w:rFonts w:ascii="Courier New" w:eastAsia="Times New Roman" w:hAnsi="Courier New" w:cs="Courier New"/>
+          <w:color w:val="BCBEC4"/>
+          <w:kern w:val="0"/>
+          <w:sz w:val="20"/>
+          <w:szCs w:val="20"/>
+          <w14:ligatures w14:val="none"/>
+        </w:rPr>
+        <w:t xml:space="preserve">* result + </w:t>
+      </w:r>
+      <w:r>
+        <w:rPr>
+          <w:rFonts w:ascii="Courier New" w:eastAsia="Times New Roman" w:hAnsi="Courier New" w:cs="Courier New"/>
+          <w:color w:val="C77DBB"/>
+          <w:kern w:val="0"/>
+          <w:sz w:val="20"/>
+          <w:szCs w:val="20"/>
+          <w14:ligatures w14:val="none"/>
+        </w:rPr>
+        <w:t>salary</w:t>
+      </w:r>
+      <w:r>
+        <w:rPr>
+          <w:rFonts w:ascii="Courier New" w:eastAsia="Times New Roman" w:hAnsi="Courier New" w:cs="Courier New"/>
+          <w:color w:val="BCBEC4"/>
+          <w:kern w:val="0"/>
+          <w:sz w:val="20"/>
+          <w:szCs w:val="20"/>
+          <w14:ligatures w14:val="none"/>
+        </w:rPr>
+        <w:t>;</w:t>
+      </w:r>
+      <w:r>
+        <w:rPr>
+          <w:rFonts w:ascii="Courier New" w:eastAsia="Times New Roman" w:hAnsi="Courier New" w:cs="Courier New"/>
+          <w:color w:val="BCBEC4"/>
+          <w:kern w:val="0"/>
+          <w:sz w:val="20"/>
+          <w:szCs w:val="20"/>
+          <w14:ligatures w14:val="none"/>
+        </w:rPr>
+        <w:br/>
+        <w:t xml:space="preserve">    </w:t>
+      </w:r>
+      <w:r>
+        <w:rPr>
+          <w:rFonts w:ascii="Courier New" w:eastAsia="Times New Roman" w:hAnsi="Courier New" w:cs="Courier New"/>
+          <w:color w:val="CF8E6D"/>
+          <w:kern w:val="0"/>
+          <w:sz w:val="20"/>
+          <w:szCs w:val="20"/>
+          <w14:ligatures w14:val="none"/>
+        </w:rPr>
+        <w:t xml:space="preserve">return </w:t>
+      </w:r>
+      <w:r>
+        <w:rPr>
+          <w:rFonts w:ascii="Courier New" w:eastAsia="Times New Roman" w:hAnsi="Courier New" w:cs="Courier New"/>
+          <w:color w:val="BCBEC4"/>
+          <w:kern w:val="0"/>
+          <w:sz w:val="20"/>
+          <w:szCs w:val="20"/>
+          <w14:ligatures w14:val="none"/>
+        </w:rPr>
+        <w:t>result;</w:t>
+      </w:r>
+      <w:r>
+        <w:rPr>
+          <w:rFonts w:ascii="Courier New" w:eastAsia="Times New Roman" w:hAnsi="Courier New" w:cs="Courier New"/>
+          <w:color w:val="BCBEC4"/>
+          <w:kern w:val="0"/>
+          <w:sz w:val="20"/>
+          <w:szCs w:val="20"/>
+          <w14:ligatures w14:val="none"/>
+        </w:rPr>
+        <w:br/>
+        <w:t>}</w:t>
+      </w:r>
+    </w:p>
+    <w:p>
+      <w:pPr>
+        <w:pStyle w:val="ListParagraph"/>
+        <w:rPr>
+          <w:rFonts w:asciiTheme="majorHAnsi" w:eastAsia="Times New Roman" w:hAnsiTheme="majorHAnsi" w:cs="Arial"/>
+          <w:color w:val="000000" w:themeColor="text1"/>
+          <w:kern w:val="0"/>
+          <w14:ligatures w14:val="none"/>
+        </w:rPr>
+      </w:pPr>
+    </w:p>
+    <w:p>
+      <w:pPr>
+        <w:pStyle w:val="ListParagraph"/>
+        <w:spacing w:after="0" w:line="240" w:lineRule="auto"/>
+        <w:ind w:left="1440"/>
+        <w:rPr>
+          <w:rFonts w:asciiTheme="majorHAnsi" w:eastAsia="Times New Roman" w:hAnsiTheme="majorHAnsi" w:cs="Arial"/>
+          <w:color w:val="000000" w:themeColor="text1"/>
+          <w:kern w:val="0"/>
+          <w14:ligatures w14:val="none"/>
+        </w:rPr>
+      </w:pPr>
     </w:p>
     <w:p>
       <w:pPr>
@@ -161,20 +738,436 @@
         <w:spacing w:after="0" w:line="240" w:lineRule="auto"/>
         <w:rPr>
           <w:rFonts w:asciiTheme="majorHAnsi" w:eastAsia="Times New Roman" w:hAnsiTheme="majorHAnsi" w:cs="Arial"/>
-          <w:color w:val="EE0000"/>
-          <w:kern w:val="0"/>
-          <w14:ligatures w14:val="none"/>
-        </w:rPr>
-      </w:pPr>
-      <w:r>
-        <w:rPr>
-          <w:rFonts w:asciiTheme="majorHAnsi" w:eastAsia="Times New Roman" w:hAnsiTheme="majorHAnsi" w:cs="Arial"/>
-          <w:color w:val="EE0000"/>
-          <w:kern w:val="0"/>
-          <w14:ligatures w14:val="none"/>
-        </w:rPr>
-        <w:t>DDDDDD</w:t>
-      </w:r>
+          <w:color w:val="000000" w:themeColor="text1"/>
+          <w:kern w:val="0"/>
+          <w14:ligatures w14:val="none"/>
+        </w:rPr>
+      </w:pPr>
+      <w:r>
+        <w:rPr>
+          <w:rFonts w:asciiTheme="majorHAnsi" w:eastAsia="Times New Roman" w:hAnsiTheme="majorHAnsi" w:cs="Arial"/>
+          <w:color w:val="000000" w:themeColor="text1"/>
+          <w:kern w:val="0"/>
+          <w14:ligatures w14:val="none"/>
+        </w:rPr>
+        <w:t>Source code:</w:t>
+      </w:r>
+    </w:p>
+    <w:p>
+      <w:pPr>
+        <w:pStyle w:val="ListParagraph"/>
+        <w:spacing w:after="0" w:line="240" w:lineRule="auto"/>
+        <w:ind w:left="1440"/>
+        <w:rPr>
+          <w:rFonts w:asciiTheme="majorHAnsi" w:eastAsia="Times New Roman" w:hAnsiTheme="majorHAnsi" w:cs="Arial"/>
+          <w:color w:val="000000" w:themeColor="text1"/>
+          <w:kern w:val="0"/>
+          <w14:ligatures w14:val="none"/>
+        </w:rPr>
+      </w:pPr>
+    </w:p>
+    <w:p>
+      <w:pPr>
+        <w:pStyle w:val="HTMLPreformatted"/>
+        <w:shd w:val="clear" w:color="auto" w:fill="191A1C"/>
+        <w:ind w:left="720"/>
+        <w:rPr>
+          <w:color w:val="BCBEC4"/>
+        </w:rPr>
+      </w:pPr>
+      <w:r>
+        <w:rPr>
+          <w:color w:val="B3AE60"/>
+        </w:rPr>
+        <w:t>@Override</w:t>
+      </w:r>
+      <w:r>
+        <w:rPr>
+          <w:color w:val="B3AE60"/>
+        </w:rPr>
+        <w:br/>
+      </w:r>
+      <w:r>
+        <w:rPr>
+          <w:color w:val="CF8E6D"/>
+        </w:rPr>
+        <w:t xml:space="preserve">public boolean </w:t>
+      </w:r>
+      <w:r>
+        <w:rPr>
+          <w:color w:val="56A8F5"/>
+        </w:rPr>
+        <w:t>equals</w:t>
+      </w:r>
+      <w:r>
+        <w:rPr>
+          <w:color w:val="BCBEC4"/>
+        </w:rPr>
+        <w:t>(Object ob) {</w:t>
+      </w:r>
+      <w:r>
+        <w:rPr>
+          <w:color w:val="BCBEC4"/>
+        </w:rPr>
+        <w:br/>
+        <w:t xml:space="preserve">    </w:t>
+      </w:r>
+      <w:r>
+        <w:rPr>
+          <w:color w:val="CF8E6D"/>
+        </w:rPr>
+        <w:t>if</w:t>
+      </w:r>
+      <w:r>
+        <w:rPr>
+          <w:color w:val="BCBEC4"/>
+        </w:rPr>
+        <w:t xml:space="preserve">(ob == </w:t>
+      </w:r>
+      <w:r>
+        <w:rPr>
+          <w:color w:val="CF8E6D"/>
+        </w:rPr>
+        <w:t>null</w:t>
+      </w:r>
+      <w:r>
+        <w:rPr>
+          <w:color w:val="BCBEC4"/>
+        </w:rPr>
+        <w:t xml:space="preserve">) </w:t>
+      </w:r>
+      <w:r>
+        <w:rPr>
+          <w:color w:val="CF8E6D"/>
+        </w:rPr>
+        <w:t>return false</w:t>
+      </w:r>
+      <w:r>
+        <w:rPr>
+          <w:color w:val="BCBEC4"/>
+        </w:rPr>
+        <w:t>;</w:t>
+      </w:r>
+      <w:r>
+        <w:rPr>
+          <w:color w:val="BCBEC4"/>
+        </w:rPr>
+        <w:br/>
+        <w:t xml:space="preserve">    </w:t>
+      </w:r>
+      <w:r>
+        <w:rPr>
+          <w:color w:val="CF8E6D"/>
+        </w:rPr>
+        <w:t>if</w:t>
+      </w:r>
+      <w:r>
+        <w:rPr>
+          <w:color w:val="BCBEC4"/>
+        </w:rPr>
+        <w:t xml:space="preserve">(!(ob </w:t>
+      </w:r>
+      <w:r>
+        <w:rPr>
+          <w:color w:val="CF8E6D"/>
+        </w:rPr>
+        <w:t xml:space="preserve">instanceof </w:t>
+      </w:r>
+      <w:r>
+        <w:rPr>
+          <w:color w:val="BCBEC4"/>
+        </w:rPr>
+        <w:t xml:space="preserve">Employee)) </w:t>
+      </w:r>
+      <w:r>
+        <w:rPr>
+          <w:color w:val="CF8E6D"/>
+        </w:rPr>
+        <w:t>return false</w:t>
+      </w:r>
+      <w:r>
+        <w:rPr>
+          <w:color w:val="BCBEC4"/>
+        </w:rPr>
+        <w:t>;</w:t>
+      </w:r>
+      <w:r>
+        <w:rPr>
+          <w:color w:val="BCBEC4"/>
+        </w:rPr>
+        <w:br/>
+        <w:t xml:space="preserve">    Employee emp = (Employee)ob;</w:t>
+      </w:r>
+      <w:r>
+        <w:rPr>
+          <w:color w:val="BCBEC4"/>
+        </w:rPr>
+        <w:br/>
+        <w:t xml:space="preserve">    </w:t>
+      </w:r>
+      <w:r>
+        <w:rPr>
+          <w:color w:val="CF8E6D"/>
+        </w:rPr>
+        <w:t xml:space="preserve">return </w:t>
+      </w:r>
+      <w:r>
+        <w:rPr>
+          <w:color w:val="BCBEC4"/>
+        </w:rPr>
+        <w:t>emp.</w:t>
+      </w:r>
+      <w:r>
+        <w:rPr>
+          <w:color w:val="C77DBB"/>
+        </w:rPr>
+        <w:t>name</w:t>
+      </w:r>
+      <w:r>
+        <w:rPr>
+          <w:color w:val="BCBEC4"/>
+        </w:rPr>
+        <w:t>.equals(</w:t>
+      </w:r>
+      <w:r>
+        <w:rPr>
+          <w:color w:val="C77DBB"/>
+        </w:rPr>
+        <w:t>name</w:t>
+      </w:r>
+      <w:r>
+        <w:rPr>
+          <w:color w:val="BCBEC4"/>
+        </w:rPr>
+        <w:t>) &amp;&amp; emp.</w:t>
+      </w:r>
+      <w:r>
+        <w:rPr>
+          <w:color w:val="C77DBB"/>
+        </w:rPr>
+        <w:t xml:space="preserve">salary </w:t>
+      </w:r>
+      <w:r>
+        <w:rPr>
+          <w:color w:val="BCBEC4"/>
+        </w:rPr>
+        <w:t xml:space="preserve">== </w:t>
+      </w:r>
+      <w:r>
+        <w:rPr>
+          <w:color w:val="C77DBB"/>
+        </w:rPr>
+        <w:t>salary</w:t>
+      </w:r>
+      <w:r>
+        <w:rPr>
+          <w:color w:val="BCBEC4"/>
+        </w:rPr>
+        <w:t xml:space="preserve">; </w:t>
+      </w:r>
+      <w:r>
+        <w:rPr>
+          <w:color w:val="7A7E85"/>
+        </w:rPr>
+        <w:t>// Bỏ emp.visited</w:t>
+      </w:r>
+      <w:r>
+        <w:rPr>
+          <w:color w:val="7A7E85"/>
+        </w:rPr>
+        <w:br/>
+      </w:r>
+      <w:r>
+        <w:rPr>
+          <w:color w:val="BCBEC4"/>
+        </w:rPr>
+        <w:t>}</w:t>
+      </w:r>
+      <w:r>
+        <w:rPr>
+          <w:color w:val="BCBEC4"/>
+        </w:rPr>
+        <w:br/>
+      </w:r>
+      <w:r>
+        <w:rPr>
+          <w:color w:val="BCBEC4"/>
+        </w:rPr>
+        <w:br/>
+      </w:r>
+      <w:r>
+        <w:rPr>
+          <w:color w:val="B3AE60"/>
+        </w:rPr>
+        <w:t>@Override</w:t>
+      </w:r>
+      <w:r>
+        <w:rPr>
+          <w:color w:val="B3AE60"/>
+        </w:rPr>
+        <w:br/>
+      </w:r>
+      <w:r>
+        <w:rPr>
+          <w:color w:val="CF8E6D"/>
+        </w:rPr>
+        <w:t xml:space="preserve">public int </w:t>
+      </w:r>
+      <w:r>
+        <w:rPr>
+          <w:color w:val="56A8F5"/>
+        </w:rPr>
+        <w:t>hashCode</w:t>
+      </w:r>
+      <w:r>
+        <w:rPr>
+          <w:color w:val="BCBEC4"/>
+        </w:rPr>
+        <w:t>() {</w:t>
+      </w:r>
+      <w:r>
+        <w:rPr>
+          <w:color w:val="BCBEC4"/>
+        </w:rPr>
+        <w:br/>
+        <w:t xml:space="preserve">    </w:t>
+      </w:r>
+      <w:r>
+        <w:rPr>
+          <w:color w:val="CF8E6D"/>
+        </w:rPr>
+        <w:t xml:space="preserve">int </w:t>
+      </w:r>
+      <w:r>
+        <w:rPr>
+          <w:color w:val="BCBEC4"/>
+        </w:rPr>
+        <w:t xml:space="preserve">result = </w:t>
+      </w:r>
+      <w:r>
+        <w:rPr>
+          <w:color w:val="2AACB8"/>
+        </w:rPr>
+        <w:t>17</w:t>
+      </w:r>
+      <w:r>
+        <w:rPr>
+          <w:color w:val="BCBEC4"/>
+        </w:rPr>
+        <w:t>;</w:t>
+      </w:r>
+      <w:r>
+        <w:rPr>
+          <w:color w:val="BCBEC4"/>
+        </w:rPr>
+        <w:br/>
+        <w:t xml:space="preserve">    result = </w:t>
+      </w:r>
+      <w:r>
+        <w:rPr>
+          <w:color w:val="2AACB8"/>
+        </w:rPr>
+        <w:t xml:space="preserve">31 </w:t>
+      </w:r>
+      <w:r>
+        <w:rPr>
+          <w:color w:val="BCBEC4"/>
+        </w:rPr>
+        <w:t xml:space="preserve">* result + </w:t>
+      </w:r>
+      <w:r>
+        <w:rPr>
+          <w:color w:val="C77DBB"/>
+        </w:rPr>
+        <w:t>name</w:t>
+      </w:r>
+      <w:r>
+        <w:rPr>
+          <w:color w:val="BCBEC4"/>
+        </w:rPr>
+        <w:t>.hashCode();</w:t>
+      </w:r>
+      <w:r>
+        <w:rPr>
+          <w:color w:val="BCBEC4"/>
+        </w:rPr>
+        <w:br/>
+        <w:t xml:space="preserve">    result = </w:t>
+      </w:r>
+      <w:r>
+        <w:rPr>
+          <w:color w:val="2AACB8"/>
+        </w:rPr>
+        <w:t xml:space="preserve">31 </w:t>
+      </w:r>
+      <w:r>
+        <w:rPr>
+          <w:color w:val="BCBEC4"/>
+        </w:rPr>
+        <w:t xml:space="preserve">* result + </w:t>
+      </w:r>
+      <w:r>
+        <w:rPr>
+          <w:color w:val="C77DBB"/>
+        </w:rPr>
+        <w:t>salary</w:t>
+      </w:r>
+      <w:r>
+        <w:rPr>
+          <w:color w:val="BCBEC4"/>
+        </w:rPr>
+        <w:t>;</w:t>
+      </w:r>
+      <w:r>
+        <w:rPr>
+          <w:color w:val="BCBEC4"/>
+        </w:rPr>
+        <w:br/>
+        <w:t xml:space="preserve">    </w:t>
+      </w:r>
+      <w:r>
+        <w:rPr>
+          <w:color w:val="CF8E6D"/>
+        </w:rPr>
+        <w:t xml:space="preserve">return </w:t>
+      </w:r>
+      <w:r>
+        <w:rPr>
+          <w:color w:val="BCBEC4"/>
+        </w:rPr>
+        <w:t>result;</w:t>
+      </w:r>
+      <w:r>
+        <w:rPr>
+          <w:color w:val="BCBEC4"/>
+        </w:rPr>
+        <w:br/>
+        <w:t>}</w:t>
+      </w:r>
+    </w:p>
+    <w:p>
+      <w:pPr>
+        <w:pStyle w:val="ListParagraph"/>
+        <w:spacing w:after="0" w:line="240" w:lineRule="auto"/>
+        <w:rPr>
+          <w:rFonts w:asciiTheme="majorHAnsi" w:eastAsia="Times New Roman" w:hAnsiTheme="majorHAnsi" w:cs="Arial"/>
+          <w:color w:val="000000" w:themeColor="text1"/>
+          <w:kern w:val="0"/>
+          <w14:ligatures w14:val="none"/>
+        </w:rPr>
+      </w:pPr>
+    </w:p>
+    <w:p>
+      <w:pPr>
+        <w:pStyle w:val="ListParagraph"/>
+        <w:spacing w:after="0" w:line="240" w:lineRule="auto"/>
+        <w:rPr>
+          <w:rFonts w:asciiTheme="majorHAnsi" w:eastAsia="Times New Roman" w:hAnsiTheme="majorHAnsi" w:cs="Arial"/>
+          <w:color w:val="000000" w:themeColor="text1"/>
+          <w:kern w:val="0"/>
+          <w14:ligatures w14:val="none"/>
+        </w:rPr>
+      </w:pPr>
     </w:p>
     <w:p>
       <w:pPr>
@@ -246,6 +1239,7 @@
           <w:kern w:val="0"/>
           <w14:ligatures w14:val="none"/>
         </w:rPr>
+        <w:lastRenderedPageBreak/>
         <w:t>Conflict: If both B and C provide a default method(), Class D doesn't know which one to use, causing a compilation error.</w:t>
       </w:r>
     </w:p>
@@ -794,7 +1788,7 @@
     <w:pPr>
       <w:pStyle w:val="Header"/>
       <w:rPr>
-        <w:lang w:val="vi-VN"/>
+        <w:lang w:val="en-US"/>
       </w:rPr>
     </w:pPr>
     <w:r>
@@ -813,7 +1807,13 @@
       <w:rPr>
         <w:lang w:val="vi-VN"/>
       </w:rPr>
-      <w:t>Assignment: Lab 1</w:t>
+      <w:t xml:space="preserve">Assignment: Lab </w:t>
+    </w:r>
+    <w:r>
+      <w:rPr>
+        <w:lang w:val="en-US"/>
+      </w:rPr>
+      <w:t>9</w:t>
     </w:r>
   </w:p>
   <w:p>
@@ -2274,6 +3274,58 @@
       <w:shd w:val="clear" w:color="auto" w:fill="E1DFDD"/>
     </w:rPr>
   </w:style>
+  <w:style w:type="paragraph" w:styleId="HTMLPreformatted">
+    <w:name w:val="HTML Preformatted"/>
+    <w:basedOn w:val="Normal"/>
+    <w:link w:val="HTMLPreformattedChar"/>
+    <w:uiPriority w:val="99"/>
+    <w:semiHidden/>
+    <w:unhideWhenUsed/>
+    <w:rsid w:val="00FE042E"/>
+    <w:pPr>
+      <w:tabs>
+        <w:tab w:val="left" w:pos="916"/>
+        <w:tab w:val="left" w:pos="1832"/>
+        <w:tab w:val="left" w:pos="2748"/>
+        <w:tab w:val="left" w:pos="3664"/>
+        <w:tab w:val="left" w:pos="4580"/>
+        <w:tab w:val="left" w:pos="5496"/>
+        <w:tab w:val="left" w:pos="6412"/>
+        <w:tab w:val="left" w:pos="7328"/>
+        <w:tab w:val="left" w:pos="8244"/>
+        <w:tab w:val="left" w:pos="9160"/>
+        <w:tab w:val="left" w:pos="10076"/>
+        <w:tab w:val="left" w:pos="10992"/>
+        <w:tab w:val="left" w:pos="11908"/>
+        <w:tab w:val="left" w:pos="12824"/>
+        <w:tab w:val="left" w:pos="13740"/>
+        <w:tab w:val="left" w:pos="14656"/>
+      </w:tabs>
+      <w:spacing w:after="0" w:line="240" w:lineRule="auto"/>
+    </w:pPr>
+    <w:rPr>
+      <w:rFonts w:ascii="Courier New" w:eastAsia="Times New Roman" w:hAnsi="Courier New" w:cs="Courier New"/>
+      <w:kern w:val="0"/>
+      <w:sz w:val="20"/>
+      <w:szCs w:val="20"/>
+      <w14:ligatures w14:val="none"/>
+    </w:rPr>
+  </w:style>
+  <w:style w:type="character" w:customStyle="1" w:styleId="HTMLPreformattedChar">
+    <w:name w:val="HTML Preformatted Char"/>
+    <w:basedOn w:val="DefaultParagraphFont"/>
+    <w:link w:val="HTMLPreformatted"/>
+    <w:uiPriority w:val="99"/>
+    <w:semiHidden/>
+    <w:rsid w:val="00FE042E"/>
+    <w:rPr>
+      <w:rFonts w:ascii="Courier New" w:eastAsia="Times New Roman" w:hAnsi="Courier New" w:cs="Courier New"/>
+      <w:kern w:val="0"/>
+      <w:sz w:val="20"/>
+      <w:szCs w:val="20"/>
+      <w14:ligatures w14:val="none"/>
+    </w:rPr>
+  </w:style>
 </w:styles>
 </file>
 

</xml_diff>